<commit_message>
Re-source materiality to the brief; split forecast-column confidence
- Materiality thresholds now come from the brief §9 (abs >€25k OR pct >10%,
  plus per-line gross-margin/expense/EBITA rules); the meeting-notes 2% is
  superseded. Customer-revenue and recurring-variance rules deferred to Phase 2.
- Actuals+FC column meaning is CONFIRMED; Previous Forecast column reading is
  only ~80% confidence and stays an assumption pending Aurilo verification.

Updated CLAUDE.md (scope, column semantics, variance rules, variance.json) and
scope docx (v1.2): §4.2 materiality/baseline confirmed, Previous Forecast bullet
flagged for verification, next-steps updated.

Co-Authored-By: Claude Opus 4.8 <noreply@anthropic.com>
</commit_message>
<xml_diff>
--- a/Aurilo_Closing_Variance_Agent_Scope_and_Dependencies.docx
+++ b/Aurilo_Closing_Variance_Agent_Scope_and_Dependencies.docx
@@ -57,7 +57,7 @@
           <w:sz w:val="19"/>
         </w:rPr>
         <w:br/>
-        <w:t>Date: 9 July 2026    |    Version: 1.1 (updated after 7 Jul follow-up meeting)</w:t>
+        <w:t>Date: 9 July 2026    |    Version: 1.2 (materiality re-sourced to the brief; Actuals+FC confirmed, Previous Forecast ~80%)</w:t>
       </w:r>
     </w:p>
     <w:p/>
@@ -576,7 +576,7 @@
         <w:t xml:space="preserve">Variance engine: </w:t>
       </w:r>
       <w:r>
-        <w:t xml:space="preserve"> flag every P&amp;L line whose month-on-month forecast movement exceeds the confirmed 2% threshold, and surface a highlighted top 5-10 by absolute magnitude.</w:t>
+        <w:t xml:space="preserve"> flag every P&amp;L line whose month-on-month forecast movement breaches any of the brief's Section 9 materiality rules (absolute &gt; EUR25k or percentage &gt; 10%, plus the per-line rules), and surface a highlighted top 5-10 by absolute magnitude.</w:t>
       </w:r>
     </w:p>
     <w:p>
@@ -847,10 +847,10 @@
         <w:rPr>
           <w:b/>
         </w:rPr>
-        <w:t xml:space="preserve">Materiality threshold - CONFIRMED (7 Jul meeting): </w:t>
+        <w:t xml:space="preserve">Materiality threshold - CONFIRMED by the brief (Section 9): </w:t>
       </w:r>
       <w:r>
-        <w:t xml:space="preserve"> 2% applies to all KPIs and all P&amp;L line items, with no line-item exceptions. Output is the full list of variances above 2% plus a highlighted top 5-10 by absolute magnitude. This supersedes the earlier EUR25k/10% and EUR100k/5% placeholders and is now locked for the pilot.</w:t>
+        <w:t xml:space="preserve"> the pilot uses the brief's Example Variance Detection Rules - absolute P&amp;L variance &gt; EUR25k and variance percentage &gt; 10%, plus the per-line rules (gross margin &gt; EUR10k, expense &gt; EUR10k, EBITA &gt; EUR20k). Customer-revenue (&gt; EUR15k) and recurring-variance rules are dimensional / history-based and move to Phase 2. This supersedes the 2% figure noted in the 7 Jul meeting.</w:t>
       </w:r>
     </w:p>
     <w:p>
@@ -861,10 +861,10 @@
         <w:rPr>
           <w:b/>
         </w:rPr>
-        <w:t xml:space="preserve">Baseline - CONFIRMED: </w:t>
+        <w:t xml:space="preserve">Baseline - CONFIRMED (Actuals+FC): </w:t>
       </w:r>
       <w:r>
-        <w:t xml:space="preserve"> the primary comparison is Current Forecast (Actuals+FC) vs Previous Forecast, i.e. how management expectations shifted over the past month.</w:t>
+        <w:t xml:space="preserve"> the primary comparison is Current Forecast (Actuals+FC) vs Previous Forecast, i.e. how management expectations shifted over the past month. The Actuals+FC column meaning is confirmed.</w:t>
       </w:r>
     </w:p>
     <w:p>
@@ -875,10 +875,10 @@
         <w:rPr>
           <w:b/>
         </w:rPr>
-        <w:t xml:space="preserve">ITDS column structure - ASSUMPTION, please verify: </w:t>
+        <w:t xml:space="preserve">Previous Forecast column - ASSUMPTION (~80% confidence), please verify: </w:t>
       </w:r>
       <w:r>
-        <w:t xml:space="preserve"> we understand Actuals+FC as the Current Forecast (closed months hold actuals, future months hold the latest revised forecast) and Previous Forecast as the same actuals but carrying last month's forecast for future months. We are building the pilot on this interpretation and ask Aurilo to confirm it is correct.</w:t>
+        <w:t xml:space="preserve"> we understand Previous Forecast as the same actuals for closed months but carrying last month's forecast for the future months. We are ~80% sure of this and are building the pilot on it, but ask Aurilo to confirm the Previous Forecast column before it is locked. (Actuals+FC is already confirmed - see above.)</w:t>
       </w:r>
     </w:p>
     <w:p>
@@ -1219,7 +1219,7 @@
         <w:t xml:space="preserve">Confirm: </w:t>
       </w:r>
       <w:r>
-        <w:t xml:space="preserve"> our ITDS column-structure assumption (Actuals+FC vs Previous Forecast, Section 4.2) and name the Finance reviewer.</w:t>
+        <w:t xml:space="preserve"> the Previous Forecast column reading (Section 4.2, ~80% confidence) and name the Finance reviewer.</w:t>
       </w:r>
     </w:p>
     <w:p>

</xml_diff>